<commit_message>
Paper 7: fix abstract claim on conversion efficiency, label stock equations
The abstract said only the integrated portfolio restores conversion efficiency
to the counterfactual level; the AI-augmented apprenticeship reaches 0.453
against a counterfactual of 0.433, so it is in fact the only single lever that
does. Also names Equations (7) to (10) explicitly where the stock chain is
introduced.

Co-Authored-By: Claude Fable 5 <noreply@anthropic.com>
Claude-Session: https://claude.ai/code/session_01D4xmAkDKwnFZcWjChhtKdD
</commit_message>
<xml_diff>
--- a/work/out/Vanishing_First_Rung_Expertise_Pipeline_Systems.docx
+++ b/work/out/Vanishing_First_Rung_Expertise_Pipeline_Systems.docx
@@ -286,7 +286,7 @@
         <w:rPr>
           <w:rFonts w:hint="eastAsia"/>
         </w:rPr>
-        <w:t>Generative artificial intelligence automates precisely the routine, supervised tasks that firms have historically used to train new graduates. Managers therefore face a decision whose costs and benefits are separated by more than a decade: every entry-level task delegated to a machine saves money now and removes a unit of practice that would have produced a proficient professional later. This paper asks what that decision does to the stock of expertise a firm can draw on, and which leadership levers can repair the damage. We combine an enterprise survey with a simulation model. Study 1 surveys 356 knowledge-intensive firms in China’s Yangtze River Delta and estimates the behavioural parameters that link automation depth to entry hiring, senior verification time, mentoring intensity and time to independent proficiency. Study 2 embeds those estimates in a five-stock system dynamics model of the entrant pool, the junior and senior workforce and the skill capital of excluded entrants, and subjects the model to dimensional, extreme-condition, structural and behaviour-reproduction tests. The calibrated model reproduces the entry-level hiring decline now observed in AI-exposed occupations and then generates a pronounced better-before-worse trajectory: productive capacity peaks 8.7% above the no-automation counterfactual in year 9, crosses back below it in year 16.6, and ends 15.4% below it in year 30, by which point the stock of proficient professionals is 46.3% smaller. Two successive regime shifts appear as automation deepens—a collapse of mentoring at an asymptotic automation depth of 0.475 and a verification bottleneck at 0.725. Structural decomposition shows that the initiating damage is done by task substitution and by the loss of learning content in the tasks that remain, not by the mentoring squeeze, which is a late-stage amplifier. Of four leadership levers, an AI-augmented apprenticeship that restores the learning content of entry work is 2.5 times more efficient than an entry-hiring subsidy per additional senior-year created, and only the integrated portfolio restores conversion efficiency to the counterfactual level. The results identify the learning content of entry work, rather than the number of entry jobs, as the system’s true leverage point.</w:t>
+        <w:t>Generative artificial intelligence automates precisely the routine, supervised tasks that firms have historically used to train new graduates. Managers therefore face a decision whose costs and benefits are separated by more than a decade: every entry-level task delegated to a machine saves money now and removes a unit of practice that would have produced a proficient professional later. This paper asks what that decision does to the stock of expertise a firm can draw on, and which leadership levers can repair the damage. We combine an enterprise survey with a simulation model. Study 1 surveys 356 knowledge-intensive firms in China’s Yangtze River Delta and estimates the behavioural parameters that link automation depth to entry hiring, senior verification time, mentoring intensity and time to independent proficiency. Study 2 embeds those estimates in a five-stock system dynamics model of the entrant pool, the junior and senior workforce and the skill capital of excluded entrants, and subjects the model to dimensional, extreme-condition, structural and behaviour-reproduction tests. The calibrated model reproduces the entry-level hiring decline now observed in AI-exposed occupations and then generates a pronounced better-before-worse trajectory: productive capacity peaks 8.7% above the no-automation counterfactual in year 9, crosses back below it in year 16.6, and ends 15.4% below it in year 30, by which point the stock of proficient professionals is 46.3% smaller. Two successive regime shifts appear as automation deepens—a collapse of mentoring at an asymptotic automation depth of 0.475 and a verification bottleneck at 0.725. Structural decomposition shows that the initiating damage is done by task substitution and by the loss of learning content in the tasks that remain, not by the mentoring squeeze, which is a late-stage amplifier. Of four leadership levers, an AI-augmented apprenticeship that restores the learning content of entry work is 2.5 times more efficient than an entry-hiring subsidy per additional senior-year created, and is the only single lever that lifts the pipeline’s conversion rate back above its pre-automation level. The results identify the learning content of entry work, rather than the number of entry jobs, as the system’s true leverage point.</w:t>
       </w:r>
     </w:p>
     <w:p>
@@ -3083,7 +3083,7 @@
           <w:i w:val="0"/>
           <w:sz w:val="20"/>
         </w:rPr>
-        <w:t xml:space="preserve"> while people wait, with departures removing skill capital in proportion to the current per-head level so that the accounting is conservative:</w:t>
+        <w:t xml:space="preserve"> while people wait, with departures removing skill capital in proportion to the current per-head level so that the accounting is conservative. Equations (7) to (10) give the four stocks in turn: the entrant pool, the junior stock, the senior stock and the pool’s skill capital.</w:t>
       </w:r>
     </w:p>
     <w:p>

</xml_diff>